<commit_message>
UI: glass + formas geométricas; QR centralizado; refinamentos
</commit_message>
<xml_diff>
--- a/backend/pdf/notificacao_preenchida.docx
+++ b/backend/pdf/notificacao_preenchida.docx
@@ -67,7 +67,7 @@
           <w:rFonts w:ascii="Times New Roman" w:hAnsi="Times New Roman"/>
           <w:sz w:val="24"/>
         </w:rPr>
-        <w:t>Aluno: Quirino Alessandro Cordeiro Gomes</w:t>
+        <w:t>Aluno: Jairo da Silva Nascimento</w:t>
       </w:r>
     </w:p>
     <w:p>
@@ -76,7 +76,7 @@
           <w:rFonts w:ascii="Times New Roman" w:hAnsi="Times New Roman"/>
           <w:sz w:val="24"/>
         </w:rPr>
-        <w:t>Turma: 2ºA</w:t>
+        <w:t>Turma: 2ºC</w:t>
       </w:r>
     </w:p>
     <w:p>
@@ -85,7 +85,7 @@
           <w:rFonts w:ascii="Times New Roman" w:hAnsi="Times New Roman"/>
           <w:sz w:val="24"/>
         </w:rPr>
-        <w:t>Data: 15 de junho de 2025</w:t>
+        <w:t>Data: 14 de junho de 2025</w:t>
       </w:r>
     </w:p>
     <w:p/>
@@ -104,7 +104,7 @@
           <w:sz w:val="24"/>
         </w:rPr>
         <w:br/>
-        <w:t>Art. 54 – 13</w:t>
+        <w:t>Art. 54 – 22</w:t>
       </w:r>
     </w:p>
     <w:p/>
@@ -114,7 +114,7 @@
           <w:rFonts w:ascii="Times New Roman" w:hAnsi="Times New Roman"/>
           <w:sz w:val="24"/>
         </w:rPr>
-        <w:t>Esta medida acarreta perda de sua nota disciplinar em -2.10 pontos, enquadrando-se no comportamento Insuficiente.</w:t>
+        <w:t>Esta medida acarreta perda de sua nota disciplinar em -0.30 pontos, enquadrando-se no comportamento Bom.</w:t>
       </w:r>
     </w:p>
     <w:p/>
@@ -149,7 +149,7 @@
                 <w:b/>
                 <w:sz w:val="24"/>
               </w:rPr>
-              <w:t>Nota Anterior: 6.10</w:t>
+              <w:t>Nota Anterior: 8.31</w:t>
             </w:r>
             <w:r>
               <w:rPr>
@@ -158,7 +158,7 @@
                 <w:sz w:val="24"/>
               </w:rPr>
               <w:br/>
-              <w:t>Nota Atual: 4.00</w:t>
+              <w:t>Nota Atual: 8.01</w:t>
             </w:r>
           </w:p>
         </w:tc>
@@ -259,7 +259,7 @@
           <w:rFonts w:ascii="Times New Roman" w:hAnsi="Times New Roman"/>
           <w:sz w:val="24"/>
         </w:rPr>
-        <w:t>teste</w:t>
+        <w:t>Foi identificado nas cameras o aluno Jairo em sala de aula na data de 13/06/2025 juntamente com Jennifer Karine Lopes Corrêa sentada no colo do aluno citado a cima além de trocando carícias estavam se beijando. Assim cabível agravantes (capitulo III) Art 14 inciso IV - cometer a falta disciplinar em público na presença de outros alunos (...)</w:t>
       </w:r>
     </w:p>
     <w:p/>
@@ -390,7 +390,7 @@
           <w:rFonts w:ascii="Times New Roman" w:hAnsi="Times New Roman"/>
           <w:sz w:val="24"/>
         </w:rPr>
-        <w:t>Cruzeiro do Sul – AC, 15 de junho de 2025</w:t>
+        <w:t>Cruzeiro do Sul – AC, 14 de junho de 2025</w:t>
       </w:r>
     </w:p>
     <w:p/>

</xml_diff>

<commit_message>
Lista de Alunos: tema rubi + contraste select, cards glass, lixeira; modal com preview; rotas/alunos e auth por cookie; ajustes upload/ficha
</commit_message>
<xml_diff>
--- a/backend/pdf/notificacao_preenchida.docx
+++ b/backend/pdf/notificacao_preenchida.docx
@@ -67,7 +67,7 @@
           <w:rFonts w:ascii="Times New Roman" w:hAnsi="Times New Roman"/>
           <w:sz w:val="24"/>
         </w:rPr>
-        <w:t>Aluno: Jairo da Silva Nascimento</w:t>
+        <w:t>Aluno: João Gabriel da Silva Freitas</w:t>
       </w:r>
     </w:p>
     <w:p>
@@ -76,7 +76,7 @@
           <w:rFonts w:ascii="Times New Roman" w:hAnsi="Times New Roman"/>
           <w:sz w:val="24"/>
         </w:rPr>
-        <w:t>Turma: 2ºC</w:t>
+        <w:t>Turma: 2ºB</w:t>
       </w:r>
     </w:p>
     <w:p>
@@ -85,7 +85,7 @@
           <w:rFonts w:ascii="Times New Roman" w:hAnsi="Times New Roman"/>
           <w:sz w:val="24"/>
         </w:rPr>
-        <w:t>Data: 14 de junho de 2025</w:t>
+        <w:t>Data: 24 de agosto de 2025</w:t>
       </w:r>
     </w:p>
     <w:p/>
@@ -104,7 +104,7 @@
           <w:sz w:val="24"/>
         </w:rPr>
         <w:br/>
-        <w:t>Art. 54 – 22</w:t>
+        <w:t>Art. 54 – 3</w:t>
       </w:r>
     </w:p>
     <w:p/>
@@ -114,7 +114,7 @@
           <w:rFonts w:ascii="Times New Roman" w:hAnsi="Times New Roman"/>
           <w:sz w:val="24"/>
         </w:rPr>
-        <w:t>Esta medida acarreta perda de sua nota disciplinar em -0.30 pontos, enquadrando-se no comportamento Bom.</w:t>
+        <w:t>Esta medida acarreta perda de sua nota disciplinar em -0.30 pontos, enquadrando-se no comportamento Regular.</w:t>
       </w:r>
     </w:p>
     <w:p/>
@@ -149,7 +149,7 @@
                 <w:b/>
                 <w:sz w:val="24"/>
               </w:rPr>
-              <w:t>Nota Anterior: 8.31</w:t>
+              <w:t>Nota Anterior: 7.43</w:t>
             </w:r>
             <w:r>
               <w:rPr>
@@ -158,7 +158,7 @@
                 <w:sz w:val="24"/>
               </w:rPr>
               <w:br/>
-              <w:t>Nota Atual: 8.01</w:t>
+              <w:t>Nota Atual: 7.43</w:t>
             </w:r>
           </w:p>
         </w:tc>
@@ -259,7 +259,7 @@
           <w:rFonts w:ascii="Times New Roman" w:hAnsi="Times New Roman"/>
           <w:sz w:val="24"/>
         </w:rPr>
-        <w:t>Foi identificado nas cameras o aluno Jairo em sala de aula na data de 13/06/2025 juntamente com Jennifer Karine Lopes Corrêa sentada no colo do aluno citado a cima além de trocando carícias estavam se beijando. Assim cabível agravantes (capitulo III) Art 14 inciso IV - cometer a falta disciplinar em público na presença de outros alunos (...)</w:t>
+        <w:t xml:space="preserve">O aluno foi identificado, pelas cameras do colegio, sentado em momento de apresentação da turma ao professor, o mesmo permaneceu sentado sorrindo enquanto os demais alunos estavam de pé em sinal de respeito. O aluno foi trazido até a monitoria para explicações, o qual afirmava estar com a perna machucada (joelho). </w:t>
       </w:r>
     </w:p>
     <w:p/>
@@ -390,7 +390,7 @@
           <w:rFonts w:ascii="Times New Roman" w:hAnsi="Times New Roman"/>
           <w:sz w:val="24"/>
         </w:rPr>
-        <w:t>Cruzeiro do Sul – AC, 14 de junho de 2025</w:t>
+        <w:t>Cruzeiro do Sul – AC, 24 de agosto de 2025</w:t>
       </w:r>
     </w:p>
     <w:p/>

</xml_diff>

<commit_message>
feat: comunicação aos pais + melhorias notificações (paginadas, filtros, UI)
</commit_message>
<xml_diff>
--- a/backend/pdf/notificacao_preenchida.docx
+++ b/backend/pdf/notificacao_preenchida.docx
@@ -67,7 +67,7 @@
           <w:rFonts w:ascii="Times New Roman" w:hAnsi="Times New Roman"/>
           <w:sz w:val="24"/>
         </w:rPr>
-        <w:t>Aluno: João Gabriel da Silva Freitas</w:t>
+        <w:t>Aluno: aluno teste 01</w:t>
       </w:r>
     </w:p>
     <w:p>
@@ -76,7 +76,7 @@
           <w:rFonts w:ascii="Times New Roman" w:hAnsi="Times New Roman"/>
           <w:sz w:val="24"/>
         </w:rPr>
-        <w:t>Turma: 2ºB</w:t>
+        <w:t>Turma: 3ºD</w:t>
       </w:r>
     </w:p>
     <w:p>
@@ -85,7 +85,7 @@
           <w:rFonts w:ascii="Times New Roman" w:hAnsi="Times New Roman"/>
           <w:sz w:val="24"/>
         </w:rPr>
-        <w:t>Data: 24 de agosto de 2025</w:t>
+        <w:t>Data: 25 de agosto de 2025</w:t>
       </w:r>
     </w:p>
     <w:p/>
@@ -104,7 +104,7 @@
           <w:sz w:val="24"/>
         </w:rPr>
         <w:br/>
-        <w:t>Art. 54 – 3</w:t>
+        <w:t>Art. 54 – 9</w:t>
       </w:r>
     </w:p>
     <w:p/>
@@ -114,7 +114,7 @@
           <w:rFonts w:ascii="Times New Roman" w:hAnsi="Times New Roman"/>
           <w:sz w:val="24"/>
         </w:rPr>
-        <w:t>Esta medida acarreta perda de sua nota disciplinar em -0.30 pontos, enquadrando-se no comportamento Regular.</w:t>
+        <w:t>Esta medida acarreta perda de sua nota disciplinar em -2.80 pontos, enquadrando-se no comportamento Regular.</w:t>
       </w:r>
     </w:p>
     <w:p/>
@@ -149,7 +149,7 @@
                 <w:b/>
                 <w:sz w:val="24"/>
               </w:rPr>
-              <w:t>Nota Anterior: 7.43</w:t>
+              <w:t>Nota Anterior: 8.80</w:t>
             </w:r>
             <w:r>
               <w:rPr>
@@ -158,7 +158,7 @@
                 <w:sz w:val="24"/>
               </w:rPr>
               <w:br/>
-              <w:t>Nota Atual: 7.43</w:t>
+              <w:t>Nota Atual: 6.00</w:t>
             </w:r>
           </w:p>
         </w:tc>
@@ -259,7 +259,7 @@
           <w:rFonts w:ascii="Times New Roman" w:hAnsi="Times New Roman"/>
           <w:sz w:val="24"/>
         </w:rPr>
-        <w:t xml:space="preserve">O aluno foi identificado, pelas cameras do colegio, sentado em momento de apresentação da turma ao professor, o mesmo permaneceu sentado sorrindo enquanto os demais alunos estavam de pé em sinal de respeito. O aluno foi trazido até a monitoria para explicações, o qual afirmava estar com a perna machucada (joelho). </w:t>
+        <w:t>teste de comunicação aos pais</w:t>
       </w:r>
     </w:p>
     <w:p/>
@@ -390,7 +390,7 @@
           <w:rFonts w:ascii="Times New Roman" w:hAnsi="Times New Roman"/>
           <w:sz w:val="24"/>
         </w:rPr>
-        <w:t>Cruzeiro do Sul – AC, 24 de agosto de 2025</w:t>
+        <w:t>Cruzeiro do Sul – AC, 25 de agosto de 2025</w:t>
       </w:r>
     </w:p>
     <w:p/>

</xml_diff>

<commit_message>
feat: aprimorado sistema de auditoria com attachActor e persistência de nome/tipo do usuário nos logs
</commit_message>
<xml_diff>
--- a/backend/pdf/notificacao_preenchida.docx
+++ b/backend/pdf/notificacao_preenchida.docx
@@ -67,7 +67,7 @@
           <w:rFonts w:ascii="Times New Roman" w:hAnsi="Times New Roman"/>
           <w:sz w:val="24"/>
         </w:rPr>
-        <w:t>Aluno: aluno teste 01</w:t>
+        <w:t>Aluno: wilckson fernando da silva nascimento</w:t>
       </w:r>
     </w:p>
     <w:p>
@@ -76,7 +76,7 @@
           <w:rFonts w:ascii="Times New Roman" w:hAnsi="Times New Roman"/>
           <w:sz w:val="24"/>
         </w:rPr>
-        <w:t>Turma: 3ºD</w:t>
+        <w:t>Turma: 9ºB</w:t>
       </w:r>
     </w:p>
     <w:p>
@@ -85,7 +85,7 @@
           <w:rFonts w:ascii="Times New Roman" w:hAnsi="Times New Roman"/>
           <w:sz w:val="24"/>
         </w:rPr>
-        <w:t>Data: 25 de agosto de 2025</w:t>
+        <w:t>Data: 16 de outubro de 2025</w:t>
       </w:r>
     </w:p>
     <w:p/>
@@ -104,7 +104,7 @@
           <w:sz w:val="24"/>
         </w:rPr>
         <w:br/>
-        <w:t>Art. 54 – 9</w:t>
+        <w:t>Art. 54 – 13</w:t>
       </w:r>
     </w:p>
     <w:p/>
@@ -114,7 +114,7 @@
           <w:rFonts w:ascii="Times New Roman" w:hAnsi="Times New Roman"/>
           <w:sz w:val="24"/>
         </w:rPr>
-        <w:t>Esta medida acarreta perda de sua nota disciplinar em -2.80 pontos, enquadrando-se no comportamento Regular.</w:t>
+        <w:t>Esta medida acarreta perda de sua nota disciplinar em -6.30 pontos, enquadrando-se no comportamento Incompatível.</w:t>
       </w:r>
     </w:p>
     <w:p/>
@@ -149,7 +149,7 @@
                 <w:b/>
                 <w:sz w:val="24"/>
               </w:rPr>
-              <w:t>Nota Anterior: 8.80</w:t>
+              <w:t>Nota Anterior: 6.25</w:t>
             </w:r>
             <w:r>
               <w:rPr>
@@ -158,7 +158,7 @@
                 <w:sz w:val="24"/>
               </w:rPr>
               <w:br/>
-              <w:t>Nota Atual: 6.00</w:t>
+              <w:t>Nota Atual: 0.00</w:t>
             </w:r>
           </w:p>
         </w:tc>
@@ -259,7 +259,7 @@
           <w:rFonts w:ascii="Times New Roman" w:hAnsi="Times New Roman"/>
           <w:sz w:val="24"/>
         </w:rPr>
-        <w:t>teste de comunicação aos pais</w:t>
+        <w:t>rezados responsáveis, Durante o período de permanência dos alunos na sala de música do Colégio Militar Dom Pedro II – Unidade de Cruzeiro do Sul, foi constatado que alguns estudantes estavam praticando brincadeiras inadequadas, capazes de colocar em risco a integridade física e a saúde de um colega. Ressaltamos que esse tipo de conduta está classificado como ato grave, conforme previsto no Regulamento Disciplinar do Colégio. Além disso, o ocorrido foi registrado em vídeo e divulgado em rede social, o que agrava a situação, por expor indevidamente a imagem de outro aluno e da própria instituição. O Colégio reafirma o compromisso com a formação moral e disciplinar de seus discentes e solicita o apoio dos responsáveis para que conversem com seus filhos sobre a importância do respeito, da responsabilidade e da boa convivência no ambiente escolar.</w:t>
       </w:r>
     </w:p>
     <w:p/>
@@ -390,7 +390,7 @@
           <w:rFonts w:ascii="Times New Roman" w:hAnsi="Times New Roman"/>
           <w:sz w:val="24"/>
         </w:rPr>
-        <w:t>Cruzeiro do Sul – AC, 25 de agosto de 2025</w:t>
+        <w:t>Cruzeiro do Sul – AC, 16 de outubro de 2025</w:t>
       </w:r>
     </w:p>
     <w:p/>

</xml_diff>

<commit_message>
feat: estatísticas no painel + correções de cadastro de aluno - Adiciona endpoint /api/estatisticas e integração com painel e estatisticas.html - Corrige logs e inclui campo instituicao em criação de aluno - Melhora middlewares e rotas de controle de notificações - Ajusta visual do painel e dashboards de comportamento
</commit_message>
<xml_diff>
--- a/backend/pdf/notificacao_preenchida.docx
+++ b/backend/pdf/notificacao_preenchida.docx
@@ -67,7 +67,7 @@
           <w:rFonts w:ascii="Times New Roman" w:hAnsi="Times New Roman"/>
           <w:sz w:val="24"/>
         </w:rPr>
-        <w:t>Aluno: wilckson fernando da silva nascimento</w:t>
+        <w:t>Aluno: Teste de editar agora</w:t>
       </w:r>
     </w:p>
     <w:p>
@@ -76,7 +76,7 @@
           <w:rFonts w:ascii="Times New Roman" w:hAnsi="Times New Roman"/>
           <w:sz w:val="24"/>
         </w:rPr>
-        <w:t>Turma: 9ºB</w:t>
+        <w:t>Turma: 6ºA</w:t>
       </w:r>
     </w:p>
     <w:p>
@@ -85,7 +85,7 @@
           <w:rFonts w:ascii="Times New Roman" w:hAnsi="Times New Roman"/>
           <w:sz w:val="24"/>
         </w:rPr>
-        <w:t>Data: 16 de outubro de 2025</w:t>
+        <w:t>Data: 22 de outubro de 2025</w:t>
       </w:r>
     </w:p>
     <w:p/>
@@ -104,7 +104,7 @@
           <w:sz w:val="24"/>
         </w:rPr>
         <w:br/>
-        <w:t>Art. 54 – 13</w:t>
+        <w:t>Art. 54 – 4</w:t>
       </w:r>
     </w:p>
     <w:p/>
@@ -114,7 +114,7 @@
           <w:rFonts w:ascii="Times New Roman" w:hAnsi="Times New Roman"/>
           <w:sz w:val="24"/>
         </w:rPr>
-        <w:t>Esta medida acarreta perda de sua nota disciplinar em -6.30 pontos, enquadrando-se no comportamento Incompatível.</w:t>
+        <w:t>Esta medida acarreta perda de sua nota disciplinar em -0.30 pontos, enquadrando-se no comportamento Insuficiente.</w:t>
       </w:r>
     </w:p>
     <w:p/>
@@ -149,7 +149,7 @@
                 <w:b/>
                 <w:sz w:val="24"/>
               </w:rPr>
-              <w:t>Nota Anterior: 6.25</w:t>
+              <w:t>Nota Anterior: 5.73</w:t>
             </w:r>
             <w:r>
               <w:rPr>
@@ -158,7 +158,7 @@
                 <w:sz w:val="24"/>
               </w:rPr>
               <w:br/>
-              <w:t>Nota Atual: 0.00</w:t>
+              <w:t>Nota Atual: 5.43</w:t>
             </w:r>
           </w:p>
         </w:tc>
@@ -259,7 +259,7 @@
           <w:rFonts w:ascii="Times New Roman" w:hAnsi="Times New Roman"/>
           <w:sz w:val="24"/>
         </w:rPr>
-        <w:t>rezados responsáveis, Durante o período de permanência dos alunos na sala de música do Colégio Militar Dom Pedro II – Unidade de Cruzeiro do Sul, foi constatado que alguns estudantes estavam praticando brincadeiras inadequadas, capazes de colocar em risco a integridade física e a saúde de um colega. Ressaltamos que esse tipo de conduta está classificado como ato grave, conforme previsto no Regulamento Disciplinar do Colégio. Além disso, o ocorrido foi registrado em vídeo e divulgado em rede social, o que agrava a situação, por expor indevidamente a imagem de outro aluno e da própria instituição. O Colégio reafirma o compromisso com a formação moral e disciplinar de seus discentes e solicita o apoio dos responsáveis para que conversem com seus filhos sobre a importância do respeito, da responsabilidade e da boa convivência no ambiente escolar.</w:t>
+        <w:t>tste</w:t>
       </w:r>
     </w:p>
     <w:p/>
@@ -390,7 +390,7 @@
           <w:rFonts w:ascii="Times New Roman" w:hAnsi="Times New Roman"/>
           <w:sz w:val="24"/>
         </w:rPr>
-        <w:t>Cruzeiro do Sul – AC, 16 de outubro de 2025</w:t>
+        <w:t>Cruzeiro do Sul – AC, 22 de outubro de 2025</w:t>
       </w:r>
     </w:p>
     <w:p/>

</xml_diff>

<commit_message>
✨ Integração completa do módulo APH (atendimentos, registro e listagem)
</commit_message>
<xml_diff>
--- a/backend/pdf/notificacao_preenchida.docx
+++ b/backend/pdf/notificacao_preenchida.docx
@@ -38,26 +38,9 @@
       <w:r>
         <w:rPr>
           <w:rFonts w:ascii="Times New Roman" w:hAnsi="Times New Roman"/>
-          <w:i/>
           <w:sz w:val="24"/>
         </w:rPr>
-        <w:t>Notificação nº {{numero</w:t>
-      </w:r>
-      <w:r>
-        <w:rPr>
-          <w:rFonts w:ascii="Times New Roman" w:hAnsi="Times New Roman"/>
-          <w:i/>
-          <w:sz w:val="24"/>
-        </w:rPr>
-        <w:t>Sequencial</w:t>
-      </w:r>
-      <w:r>
-        <w:rPr>
-          <w:rFonts w:ascii="Times New Roman" w:hAnsi="Times New Roman"/>
-          <w:i/>
-          <w:sz w:val="24"/>
-        </w:rPr>
-        <w:t>}}</w:t>
+        <w:t>Notificação nº 1031/2025</w:t>
       </w:r>
     </w:p>
     <w:p/>
@@ -67,7 +50,7 @@
           <w:rFonts w:ascii="Times New Roman" w:hAnsi="Times New Roman"/>
           <w:sz w:val="24"/>
         </w:rPr>
-        <w:t>Aluno: Teste de editar agora</w:t>
+        <w:t>Aluno: teste</w:t>
       </w:r>
     </w:p>
     <w:p>
@@ -76,7 +59,7 @@
           <w:rFonts w:ascii="Times New Roman" w:hAnsi="Times New Roman"/>
           <w:sz w:val="24"/>
         </w:rPr>
-        <w:t>Turma: 6ºA</w:t>
+        <w:t>Turma: 1ºA</w:t>
       </w:r>
     </w:p>
     <w:p>
@@ -85,26 +68,7 @@
           <w:rFonts w:ascii="Times New Roman" w:hAnsi="Times New Roman"/>
           <w:sz w:val="24"/>
         </w:rPr>
-        <w:t>Data: 22 de outubro de 2025</w:t>
-      </w:r>
-    </w:p>
-    <w:p/>
-    <w:p>
-      <w:r>
-        <w:rPr>
-          <w:rFonts w:ascii="Times New Roman" w:hAnsi="Times New Roman"/>
-          <w:b/>
-          <w:sz w:val="24"/>
-        </w:rPr>
-        <w:t>Descrição da Infração:</w:t>
-      </w:r>
-      <w:r>
-        <w:rPr>
-          <w:rFonts w:ascii="Times New Roman" w:hAnsi="Times New Roman"/>
-          <w:sz w:val="24"/>
-        </w:rPr>
-        <w:br/>
-        <w:t>Art. 54 – 4</w:t>
+        <w:t>Data: 24 de outubro de 2025</w:t>
       </w:r>
     </w:p>
     <w:p/>
@@ -114,7 +78,19 @@
           <w:rFonts w:ascii="Times New Roman" w:hAnsi="Times New Roman"/>
           <w:sz w:val="24"/>
         </w:rPr>
-        <w:t>Esta medida acarreta perda de sua nota disciplinar em -0.30 pontos, enquadrando-se no comportamento Insuficiente.</w:t>
+        <w:t>Descrição da Infração:</w:t>
+        <w:br/>
+        <w:t>Art. 54 – 17</w:t>
+      </w:r>
+    </w:p>
+    <w:p/>
+    <w:p>
+      <w:r>
+        <w:rPr>
+          <w:rFonts w:ascii="Times New Roman" w:hAnsi="Times New Roman"/>
+          <w:sz w:val="24"/>
+        </w:rPr>
+        <w:t>Esta medida acarreta perda de sua nota disciplinar em -0.30 pontos, enquadrando-se no comportamento Bom.</w:t>
       </w:r>
     </w:p>
     <w:p/>
@@ -146,19 +122,11 @@
             <w:r>
               <w:rPr>
                 <w:rFonts w:ascii="Times New Roman" w:hAnsi="Times New Roman"/>
-                <w:b/>
                 <w:sz w:val="24"/>
               </w:rPr>
-              <w:t>Nota Anterior: 5.73</w:t>
-            </w:r>
-            <w:r>
-              <w:rPr>
-                <w:rFonts w:ascii="Times New Roman" w:hAnsi="Times New Roman"/>
-                <w:b/>
-                <w:sz w:val="24"/>
-              </w:rPr>
+              <w:t>Nota Anterior: 8.00</w:t>
               <w:br/>
-              <w:t>Nota Atual: 5.43</w:t>
+              <w:t>Nota Atual: 7.70</w:t>
             </w:r>
           </w:p>
         </w:tc>
@@ -259,7 +227,7 @@
           <w:rFonts w:ascii="Times New Roman" w:hAnsi="Times New Roman"/>
           <w:sz w:val="24"/>
         </w:rPr>
-        <w:t>tste</w:t>
+        <w:t>teste doc</w:t>
       </w:r>
     </w:p>
     <w:p/>
@@ -369,13 +337,6 @@
           <w:rFonts w:ascii="Times New Roman" w:hAnsi="Times New Roman"/>
           <w:sz w:val="24"/>
         </w:rPr>
-        <w:t>3ºSGT BM Helder Freire da Silva</w:t>
-      </w:r>
-      <w:r>
-        <w:rPr>
-          <w:rFonts w:ascii="Times New Roman" w:hAnsi="Times New Roman"/>
-          <w:sz w:val="24"/>
-        </w:rPr>
         <w:br/>
         <w:t>Coordenador do Corpo de Alunos do CMDP II-CZS</w:t>
       </w:r>
@@ -390,12 +351,13 @@
           <w:rFonts w:ascii="Times New Roman" w:hAnsi="Times New Roman"/>
           <w:sz w:val="24"/>
         </w:rPr>
-        <w:t>Cruzeiro do Sul – AC, 22 de outubro de 2025</w:t>
+        <w:t>Cruzeiro do Sul – AC, 24 de outubro de 2025</w:t>
       </w:r>
     </w:p>
     <w:p/>
     <w:sectPr>
       <w:headerReference w:type="default" r:id="rId8"/>
+      <w:footerReference w:type="default" r:id="rId11"/>
       <w:pgSz w:w="12240" w:h="15840"/>
       <w:pgMar w:top="1417" w:right="1701" w:bottom="1417" w:left="1701" w:header="720" w:footer="720" w:gutter="0"/>
       <w:cols w:space="720"/>
@@ -428,6 +390,16 @@
     </w:p>
   </w:endnote>
 </w:endnotes>
+</file>
+
+<file path=word/footer1.xml><?xml version="1.0" encoding="utf-8"?>
+<w:ftr xmlns:m="http://schemas.openxmlformats.org/officeDocument/2006/math" xmlns:mc="http://schemas.openxmlformats.org/markup-compatibility/2006" xmlns:mo="http://schemas.microsoft.com/office/mac/office/2008/main" xmlns:mv="urn:schemas-microsoft-com:mac:vml" xmlns:o="urn:schemas-microsoft-com:office:office" xmlns:r="http://schemas.openxmlformats.org/officeDocument/2006/relationships" xmlns:v="urn:schemas-microsoft-com:vml" xmlns:w10="urn:schemas-microsoft-com:office:word" xmlns:w14="http://schemas.microsoft.com/office/word/2010/wordml" xmlns:w="http://schemas.openxmlformats.org/wordprocessingml/2006/main" xmlns:wne="http://schemas.microsoft.com/office/word/2006/wordml" xmlns:wp14="http://schemas.microsoft.com/office/word/2010/wordprocessingDrawing" xmlns:wp="http://schemas.openxmlformats.org/drawingml/2006/wordprocessingDrawing" xmlns:wpc="http://schemas.microsoft.com/office/word/2010/wordprocessingCanvas" xmlns:wpg="http://schemas.microsoft.com/office/word/2010/wordprocessingGroup" xmlns:wpi="http://schemas.microsoft.com/office/word/2010/wordprocessingInk" xmlns:wps="http://schemas.microsoft.com/office/word/2010/wordprocessingShape" mc:Ignorable="w14 wp14">
+  <w:p>
+    <w:pPr>
+      <w:pStyle w:val="Footer"/>
+    </w:pPr>
+  </w:p>
+</w:ftr>
 </file>
 
 <file path=word/footnotes.xml><?xml version="1.0" encoding="utf-8"?>
@@ -502,9 +474,10 @@
           </w:pPr>
           <w:r>
             <w:rPr>
-              <w:rFonts w:ascii="Arial" w:hAnsi="Arial"/>
+              <w:rFonts w:ascii="Times New Roman" w:hAnsi="Times New Roman"/>
               <w:b/>
               <w:noProof/>
+              <w:sz w:val="24"/>
               <w:lang w:eastAsia="pt-BR"/>
             </w:rPr>
             <w:drawing>
@@ -580,8 +553,9 @@
           </w:pPr>
           <w:r>
             <w:rPr>
-              <w:rFonts w:ascii="Arial" w:hAnsi="Arial"/>
+              <w:rFonts w:ascii="Times New Roman" w:hAnsi="Times New Roman"/>
               <w:b/>
+              <w:sz w:val="24"/>
             </w:rPr>
             <w:t>ESTADO DO ACRE</w:t>
           </w:r>
@@ -597,8 +571,9 @@
           </w:pPr>
           <w:r>
             <w:rPr>
-              <w:rFonts w:ascii="Arial" w:hAnsi="Arial"/>
+              <w:rFonts w:ascii="Times New Roman" w:hAnsi="Times New Roman"/>
               <w:b/>
+              <w:sz w:val="24"/>
             </w:rPr>
             <w:t>CORPO DE BOMBEIROS MILITAR</w:t>
           </w:r>
@@ -615,38 +590,39 @@
           </w:pPr>
           <w:r>
             <w:rPr>
-              <w:rFonts w:ascii="Arial" w:hAnsi="Arial" w:cs="Arial"/>
+              <w:rFonts w:ascii="Times New Roman" w:hAnsi="Times New Roman" w:cs="Arial"/>
               <w:b/>
               <w:bCs/>
-              <w:sz w:val="20"/>
+              <w:sz w:val="24"/>
               <w:szCs w:val="16"/>
             </w:rPr>
             <w:t>SECRETARIA DE ESTADO D</w:t>
           </w:r>
           <w:r>
             <w:rPr>
-              <w:rFonts w:ascii="Arial" w:hAnsi="Arial" w:cs="Arial"/>
+              <w:rFonts w:ascii="Times New Roman" w:hAnsi="Times New Roman" w:cs="Arial"/>
               <w:b/>
               <w:bCs/>
-              <w:sz w:val="20"/>
+              <w:sz w:val="24"/>
               <w:szCs w:val="16"/>
             </w:rPr>
             <w:t>E</w:t>
           </w:r>
           <w:r>
             <w:rPr>
-              <w:rFonts w:ascii="Arial" w:hAnsi="Arial" w:cs="Arial"/>
+              <w:rFonts w:ascii="Times New Roman" w:hAnsi="Times New Roman" w:cs="Arial"/>
               <w:b/>
               <w:bCs/>
-              <w:sz w:val="20"/>
+              <w:sz w:val="24"/>
               <w:szCs w:val="16"/>
             </w:rPr>
             <w:t xml:space="preserve"> EDUCAÇÃO, CULTURA E ESPORTES</w:t>
           </w:r>
           <w:r>
             <w:rPr>
-              <w:rFonts w:ascii="Arial" w:hAnsi="Arial"/>
+              <w:rFonts w:ascii="Times New Roman" w:hAnsi="Times New Roman"/>
               <w:b/>
+              <w:sz w:val="24"/>
             </w:rPr>
             <w:t xml:space="preserve"> </w:t>
           </w:r>
@@ -662,8 +638,9 @@
           </w:pPr>
           <w:r>
             <w:rPr>
-              <w:rFonts w:ascii="Arial" w:hAnsi="Arial"/>
+              <w:rFonts w:ascii="Times New Roman" w:hAnsi="Times New Roman"/>
               <w:b/>
+              <w:sz w:val="24"/>
             </w:rPr>
             <w:t>COLÉGIO MILITAR DOM PEDRO II</w:t>
           </w:r>
@@ -689,7 +666,9 @@
           </w:pPr>
           <w:r>
             <w:rPr>
+              <w:rFonts w:ascii="Times New Roman" w:hAnsi="Times New Roman"/>
               <w:noProof/>
+              <w:sz w:val="24"/>
             </w:rPr>
             <w:drawing>
               <wp:anchor distT="0" distB="0" distL="114300" distR="114300" simplePos="0" relativeHeight="251659264" behindDoc="1" locked="0" layoutInCell="1" allowOverlap="1" wp14:anchorId="5093B25F" wp14:editId="4D2ECC57">

</xml_diff>

<commit_message>
fix(pdf): corrigir cálculo da Nota Atual no DOCX
</commit_message>
<xml_diff>
--- a/backend/pdf/notificacao_preenchida.docx
+++ b/backend/pdf/notificacao_preenchida.docx
@@ -40,7 +40,7 @@
           <w:rFonts w:ascii="Times New Roman" w:hAnsi="Times New Roman"/>
           <w:sz w:val="24"/>
         </w:rPr>
-        <w:t>Notificação nº 1031/2025</w:t>
+        <w:t>Notificação nº 1230/2025</w:t>
       </w:r>
     </w:p>
     <w:p/>
@@ -50,7 +50,7 @@
           <w:rFonts w:ascii="Times New Roman" w:hAnsi="Times New Roman"/>
           <w:sz w:val="24"/>
         </w:rPr>
-        <w:t>Aluno: teste</w:t>
+        <w:t>Aluno: aluno teste 01</w:t>
       </w:r>
     </w:p>
     <w:p>
@@ -59,7 +59,7 @@
           <w:rFonts w:ascii="Times New Roman" w:hAnsi="Times New Roman"/>
           <w:sz w:val="24"/>
         </w:rPr>
-        <w:t>Turma: 1ºA</w:t>
+        <w:t>Turma: 3ºD</w:t>
       </w:r>
     </w:p>
     <w:p>
@@ -68,7 +68,7 @@
           <w:rFonts w:ascii="Times New Roman" w:hAnsi="Times New Roman"/>
           <w:sz w:val="24"/>
         </w:rPr>
-        <w:t>Data: 24 de outubro de 2025</w:t>
+        <w:t>Data: 02 de novembro de 2025</w:t>
       </w:r>
     </w:p>
     <w:p/>
@@ -90,7 +90,7 @@
           <w:rFonts w:ascii="Times New Roman" w:hAnsi="Times New Roman"/>
           <w:sz w:val="24"/>
         </w:rPr>
-        <w:t>Esta medida acarreta perda de sua nota disciplinar em -0.30 pontos, enquadrando-se no comportamento Bom.</w:t>
+        <w:t>Esta medida acarreta perda de sua nota disciplinar em -0.50 pontos, enquadrando-se no comportamento Insuficiente.</w:t>
       </w:r>
     </w:p>
     <w:p/>
@@ -124,9 +124,9 @@
                 <w:rFonts w:ascii="Times New Roman" w:hAnsi="Times New Roman"/>
                 <w:sz w:val="24"/>
               </w:rPr>
-              <w:t>Nota Anterior: 8.00</w:t>
+              <w:t>Nota Anterior: 5.21</w:t>
               <w:br/>
-              <w:t>Nota Atual: 7.70</w:t>
+              <w:t>Nota Atual: 4.71</w:t>
             </w:r>
           </w:p>
         </w:tc>
@@ -227,7 +227,7 @@
           <w:rFonts w:ascii="Times New Roman" w:hAnsi="Times New Roman"/>
           <w:sz w:val="24"/>
         </w:rPr>
-        <w:t>teste doc</w:t>
+        <w:t>test</w:t>
       </w:r>
     </w:p>
     <w:p/>
@@ -351,7 +351,7 @@
           <w:rFonts w:ascii="Times New Roman" w:hAnsi="Times New Roman"/>
           <w:sz w:val="24"/>
         </w:rPr>
-        <w:t>Cruzeiro do Sul – AC, 24 de outubro de 2025</w:t>
+        <w:t>Cruzeiro do Sul – AC, 02 de novembro de 2025</w:t>
       </w:r>
     </w:p>
     <w:p/>

</xml_diff>

<commit_message>
feat(disciplinar): adiciona assinatura eletrônica institucional e integração do livro digital
</commit_message>
<xml_diff>
--- a/backend/pdf/notificacao_preenchida.docx
+++ b/backend/pdf/notificacao_preenchida.docx
@@ -1,6 +1,6 @@
 
 <file path=word/document.xml><?xml version="1.0" encoding="utf-8"?>
-<w:document xmlns:wpc="http://schemas.microsoft.com/office/word/2010/wordprocessingCanvas" xmlns:cx="http://schemas.microsoft.com/office/drawing/2014/chartex" xmlns:cx1="http://schemas.microsoft.com/office/drawing/2015/9/8/chartex" xmlns:cx2="http://schemas.microsoft.com/office/drawing/2015/10/21/chartex" xmlns:cx3="http://schemas.microsoft.com/office/drawing/2016/5/9/chartex" xmlns:cx4="http://schemas.microsoft.com/office/drawing/2016/5/10/chartex" xmlns:cx5="http://schemas.microsoft.com/office/drawing/2016/5/11/chartex" xmlns:cx6="http://schemas.microsoft.com/office/drawing/2016/5/12/chartex" xmlns:cx7="http://schemas.microsoft.com/office/drawing/2016/5/13/chartex" xmlns:cx8="http://schemas.microsoft.com/office/drawing/2016/5/14/chartex" xmlns:mc="http://schemas.openxmlformats.org/markup-compatibility/2006" xmlns:aink="http://schemas.microsoft.com/office/drawing/2016/ink" xmlns:am3d="http://schemas.microsoft.com/office/drawing/2017/model3d" xmlns:o="urn:schemas-microsoft-com:office:office" xmlns:oel="http://schemas.microsoft.com/office/2019/extlst" xmlns:r="http://schemas.openxmlformats.org/officeDocument/2006/relationships" xmlns:m="http://schemas.openxmlformats.org/officeDocument/2006/math" xmlns:v="urn:schemas-microsoft-com:vml" xmlns:wp14="http://schemas.microsoft.com/office/word/2010/wordprocessingDrawing" xmlns:wp="http://schemas.openxmlformats.org/drawingml/2006/wordprocessingDrawing" xmlns:w10="urn:schemas-microsoft-com:office:word" xmlns:w="http://schemas.openxmlformats.org/wordprocessingml/2006/main" xmlns:w14="http://schemas.microsoft.com/office/word/2010/wordml" xmlns:w15="http://schemas.microsoft.com/office/word/2012/wordml" xmlns:w16cex="http://schemas.microsoft.com/office/word/2018/wordml/cex" xmlns:w16cid="http://schemas.microsoft.com/office/word/2016/wordml/cid" xmlns:w16="http://schemas.microsoft.com/office/word/2018/wordml" xmlns:w16du="http://schemas.microsoft.com/office/word/2023/wordml/word16du" xmlns:w16sdtdh="http://schemas.microsoft.com/office/word/2020/wordml/sdtdatahash" xmlns:w16sdtfl="http://schemas.microsoft.com/office/word/2024/wordml/sdtformatlock" xmlns:w16se="http://schemas.microsoft.com/office/word/2015/wordml/symex" xmlns:wpg="http://schemas.microsoft.com/office/word/2010/wordprocessingGroup" xmlns:wpi="http://schemas.microsoft.com/office/word/2010/wordprocessingInk" xmlns:wne="http://schemas.microsoft.com/office/word/2006/wordml" xmlns:wps="http://schemas.microsoft.com/office/word/2010/wordprocessingShape" mc:Ignorable="w14 w15 w16se w16cid w16 w16cex w16sdtdh w16sdtfl w16du wp14">
+<w:document xmlns:wpc="http://schemas.microsoft.com/office/word/2010/wordprocessingCanvas" xmlns:cx="http://schemas.microsoft.com/office/drawing/2014/chartex" xmlns:cx1="http://schemas.microsoft.com/office/drawing/2015/9/8/chartex" xmlns:mc="http://schemas.openxmlformats.org/markup-compatibility/2006" xmlns:o="urn:schemas-microsoft-com:office:office" xmlns:r="http://schemas.openxmlformats.org/officeDocument/2006/relationships" xmlns:m="http://schemas.openxmlformats.org/officeDocument/2006/math" xmlns:v="urn:schemas-microsoft-com:vml" xmlns:wp14="http://schemas.microsoft.com/office/word/2010/wordprocessingDrawing" xmlns:wp="http://schemas.openxmlformats.org/drawingml/2006/wordprocessingDrawing" xmlns:w10="urn:schemas-microsoft-com:office:word" xmlns:w="http://schemas.openxmlformats.org/wordprocessingml/2006/main" xmlns:w14="http://schemas.microsoft.com/office/word/2010/wordml" xmlns:w15="http://schemas.microsoft.com/office/word/2012/wordml" xmlns:w16se="http://schemas.microsoft.com/office/word/2015/wordml/symex" xmlns:wpg="http://schemas.microsoft.com/office/word/2010/wordprocessingGroup" xmlns:wpi="http://schemas.microsoft.com/office/word/2010/wordprocessingInk" xmlns:wne="http://schemas.microsoft.com/office/word/2006/wordml" xmlns:wps="http://schemas.microsoft.com/office/word/2010/wordprocessingShape" mc:Ignorable="w14 w15 w16se wp14">
   <w:body>
     <w:p>
       <w:pPr>
@@ -48,7 +48,7 @@
           <w:rFonts w:ascii="Times New Roman" w:hAnsi="Times New Roman"/>
           <w:sz w:val="24"/>
         </w:rPr>
-        <w:t>Notificação nº 0169/2026</w:t>
+        <w:t>Notificação nº 0216/2026</w:t>
       </w:r>
     </w:p>
     <w:p/>
@@ -69,6 +69,7 @@
             <w:tcW w:w="2880" w:type="dxa"/>
           </w:tcPr>
           <w:p>
+            <w:proofErr w:type="spellStart"/>
             <w:r>
               <w:rPr>
                 <w:rFonts w:ascii="Times New Roman" w:hAnsi="Times New Roman"/>
@@ -76,6 +77,7 @@
               </w:rPr>
               <w:t>Aluno</w:t>
             </w:r>
+            <w:proofErr w:type="spellEnd"/>
           </w:p>
         </w:tc>
         <w:tc>
@@ -83,6 +85,7 @@
             <w:tcW w:w="2880" w:type="dxa"/>
           </w:tcPr>
           <w:p>
+            <w:proofErr w:type="spellStart"/>
             <w:r>
               <w:rPr>
                 <w:rFonts w:ascii="Times New Roman" w:hAnsi="Times New Roman"/>
@@ -90,6 +93,7 @@
               </w:rPr>
               <w:t>Turma</w:t>
             </w:r>
+            <w:proofErr w:type="spellEnd"/>
           </w:p>
         </w:tc>
         <w:tc>
@@ -118,7 +122,7 @@
                 <w:rFonts w:ascii="Times New Roman" w:hAnsi="Times New Roman"/>
                 <w:sz w:val="24"/>
               </w:rPr>
-              <w:t>Lucca Ismael dos Santos Borges</w:t>
+              <w:t>Luís Eduardo Lima da Silva</w:t>
             </w:r>
           </w:p>
         </w:tc>
@@ -132,7 +136,7 @@
                 <w:rFonts w:ascii="Times New Roman" w:hAnsi="Times New Roman"/>
                 <w:sz w:val="24"/>
               </w:rPr>
-              <w:t>3ºC</w:t>
+              <w:t>2ºA</w:t>
             </w:r>
           </w:p>
         </w:tc>
@@ -146,7 +150,7 @@
                 <w:rFonts w:ascii="Times New Roman" w:hAnsi="Times New Roman"/>
                 <w:sz w:val="24"/>
               </w:rPr>
-              <w:t>09 de abril de 2026</w:t>
+              <w:t>14 de abril de 2026</w:t>
             </w:r>
           </w:p>
         </w:tc>
@@ -154,14 +158,34 @@
     </w:tbl>
     <w:p/>
     <w:p>
+      <w:proofErr w:type="spellStart"/>
       <w:r>
         <w:rPr>
           <w:rFonts w:ascii="Times New Roman" w:hAnsi="Times New Roman"/>
           <w:b/>
           <w:sz w:val="24"/>
         </w:rPr>
-        <w:t>Descrição da ocorrência</w:t>
+        <w:t>Descrição</w:t>
       </w:r>
+      <w:proofErr w:type="spellEnd"/>
+      <w:r>
+        <w:rPr>
+          <w:rFonts w:ascii="Times New Roman" w:hAnsi="Times New Roman"/>
+          <w:b/>
+          <w:sz w:val="24"/>
+        </w:rPr>
+        <w:t xml:space="preserve"> da </w:t>
+      </w:r>
+      <w:proofErr w:type="spellStart"/>
+      <w:r>
+        <w:rPr>
+          <w:rFonts w:ascii="Times New Roman" w:hAnsi="Times New Roman"/>
+          <w:b/>
+          <w:sz w:val="24"/>
+        </w:rPr>
+        <w:t>ocorrência</w:t>
+      </w:r>
+      <w:proofErr w:type="spellEnd"/>
     </w:p>
     <w:p>
       <w:r>
@@ -169,7 +193,11 @@
           <w:rFonts w:ascii="Times New Roman" w:hAnsi="Times New Roman"/>
           <w:sz w:val="24"/>
         </w:rPr>
-        <w:t>Art. 54 | 4 | Motivo: Dirigir-se ou referir-se a qualquer servidor, militar ou civil e aos demais alunos usando apelidos ou palavrões</w:t>
+        <w:t>Art. 54. § 2º</w:t>
+        <w:br/>
+        <w:t>Classificação: medio</w:t>
+        <w:br/>
+        <w:t>IX – Chegar atrasado à aula, formatura, atividade, ou qualquer evento fora do colégio</w:t>
       </w:r>
     </w:p>
     <w:p/>
@@ -189,19 +217,39 @@
           <w:rFonts w:ascii="Times New Roman" w:hAnsi="Times New Roman"/>
           <w:sz w:val="24"/>
         </w:rPr>
-        <w:t>Esta ocorrência resultou em redução de 0.50 pontos, enquadrando o(a) aluno(a) no comportamento Regular.</w:t>
+        <w:t>Esta ocorrência resultou em redução de 0.30 pontos, enquadrando o(a) aluno(a) no comportamento Bom.</w:t>
       </w:r>
     </w:p>
     <w:p/>
     <w:p>
+      <w:proofErr w:type="spellStart"/>
       <w:r>
         <w:rPr>
           <w:rFonts w:ascii="Times New Roman" w:hAnsi="Times New Roman"/>
           <w:b/>
           <w:sz w:val="24"/>
         </w:rPr>
-        <w:t>Evolução do comportamento</w:t>
+        <w:t>Evolução</w:t>
       </w:r>
+      <w:proofErr w:type="spellEnd"/>
+      <w:r>
+        <w:rPr>
+          <w:rFonts w:ascii="Times New Roman" w:hAnsi="Times New Roman"/>
+          <w:b/>
+          <w:sz w:val="24"/>
+        </w:rPr>
+        <w:t xml:space="preserve"> do </w:t>
+      </w:r>
+      <w:proofErr w:type="spellStart"/>
+      <w:r>
+        <w:rPr>
+          <w:rFonts w:ascii="Times New Roman" w:hAnsi="Times New Roman"/>
+          <w:b/>
+          <w:sz w:val="24"/>
+        </w:rPr>
+        <w:t>comportamento</w:t>
+      </w:r>
+      <w:proofErr w:type="spellEnd"/>
     </w:p>
     <w:tbl>
       <w:tblPr>
@@ -239,8 +287,17 @@
                 <w:rFonts w:ascii="Times New Roman" w:hAnsi="Times New Roman"/>
                 <w:sz w:val="24"/>
               </w:rPr>
-              <w:t>Nota Atual</w:t>
+              <w:t xml:space="preserve">Nota </w:t>
             </w:r>
+            <w:proofErr w:type="spellStart"/>
+            <w:r>
+              <w:rPr>
+                <w:rFonts w:ascii="Times New Roman" w:hAnsi="Times New Roman"/>
+                <w:sz w:val="24"/>
+              </w:rPr>
+              <w:t>Atual</w:t>
+            </w:r>
+            <w:proofErr w:type="spellEnd"/>
           </w:p>
         </w:tc>
         <w:tc>
@@ -248,6 +305,7 @@
             <w:tcW w:w="2880" w:type="dxa"/>
           </w:tcPr>
           <w:p>
+            <w:proofErr w:type="spellStart"/>
             <w:r>
               <w:rPr>
                 <w:rFonts w:ascii="Times New Roman" w:hAnsi="Times New Roman"/>
@@ -255,6 +313,7 @@
               </w:rPr>
               <w:t>Classificação</w:t>
             </w:r>
+            <w:proofErr w:type="spellEnd"/>
           </w:p>
         </w:tc>
       </w:tr>
@@ -269,7 +328,7 @@
                 <w:rFonts w:ascii="Times New Roman" w:hAnsi="Times New Roman"/>
                 <w:sz w:val="24"/>
               </w:rPr>
-              <w:t>6.10</w:t>
+              <w:t>7.57</w:t>
             </w:r>
           </w:p>
         </w:tc>
@@ -283,7 +342,7 @@
                 <w:rFonts w:ascii="Times New Roman" w:hAnsi="Times New Roman"/>
                 <w:sz w:val="24"/>
               </w:rPr>
-              <w:t>5.60</w:t>
+              <w:t>7.27</w:t>
             </w:r>
           </w:p>
         </w:tc>
@@ -297,7 +356,7 @@
                 <w:rFonts w:ascii="Times New Roman" w:hAnsi="Times New Roman"/>
                 <w:sz w:val="24"/>
               </w:rPr>
-              <w:t>Regular</w:t>
+              <w:t>Bom</w:t>
             </w:r>
           </w:p>
         </w:tc>
@@ -305,13 +364,23 @@
     </w:tbl>
     <w:p/>
     <w:p>
+      <w:proofErr w:type="spellStart"/>
       <w:r>
         <w:rPr>
           <w:rFonts w:ascii="Times New Roman" w:hAnsi="Times New Roman"/>
           <w:b/>
           <w:sz w:val="24"/>
         </w:rPr>
-        <w:t>Observação do monitor</w:t>
+        <w:t>Observação</w:t>
+      </w:r>
+      <w:proofErr w:type="spellEnd"/>
+      <w:r>
+        <w:rPr>
+          <w:rFonts w:ascii="Times New Roman" w:hAnsi="Times New Roman"/>
+          <w:b/>
+          <w:sz w:val="24"/>
+        </w:rPr>
+        <w:t xml:space="preserve"> do monitor</w:t>
       </w:r>
     </w:p>
     <w:p>
@@ -320,26 +389,22 @@
           <w:rFonts w:ascii="Times New Roman" w:hAnsi="Times New Roman"/>
           <w:sz w:val="24"/>
         </w:rPr>
-        <w:t>Art. 54 – Classificação Básica dos Atos de Indisciplina</w:t>
+        <w:t>Classificação Básica dos Atos de Indisciplina</w:t>
         <w:br/>
-        <w:t>§ 3º – Classificação Básica dos Atos de Indisciplina (Grave)</w:t>
+        <w:t>Art. 54. A classificação básica dos Atos de Indisciplina será assim considerada:</w:t>
         <w:br/>
-        <w:t>IV – Dirigir-se ou referir-se a qualquer servidor, militar ou civil, e aos demais alunos utilizando apelidos ou palavras ofensivas.</w:t>
+        <w:t>§ 2º – Classificação Básica dos Atos de Indisciplina (Médio)</w:t>
+        <w:br/>
+        <w:t>IX – Chegar atrasado à aula, formatura, atividade ou qualquer evento fora do colégio.</w:t>
         <w:br/>
         <w:br/>
-        <w:t>Prezados senhores pais ou responsáveis,</w:t>
+        <w:t>Prezados pais ou responsáveis,</w:t>
         <w:br/>
         <w:br/>
-        <w:t>Informamos que o aluno foi notificado disciplinarmente por ter se dirigido à Professora Iranilda de forma desrespeitosa, utilizando apelido inadequado.</w:t>
+        <w:t>Informamos que o aluno foi notificado disciplinarmente por ter chegado atrasado, tendo em vista que todos os alunos devem estar na quadra às 12h50 para participarem da parada diária.</w:t>
         <w:br/>
         <w:br/>
-        <w:t>Conforme relato da docente, esta não foi a primeira ocorrência. Em situações anteriores, a professora optou por advertências verbais, buscando orientar o aluno. No entanto, apesar das intervenções, o comportamento voltou a ocorrer nesta data, caracterizando reincidência e atingindo o limite tolerável.</w:t>
-        <w:br/>
-        <w:br/>
-        <w:t>Diante do exposto, solicitamos aos responsáveis que reforcem junto ao aluno a importância de manter uma postura respeitosa com colegas, professores e toda a comunidade escolar, contribuindo para um ambiente saudável e harmonioso.</w:t>
-        <w:br/>
-        <w:br/>
-        <w:t>Sem mais, o aluno permanece devidamente notificado, e colocamo-nos à disposição para quaisquer esclarecimentos.</w:t>
+        <w:t>Diante disso, solicitamos aos senhores que orientem o aluno quanto à necessidade de cumprir os horários preestabelecidos por este colégio, a fim de mantermos um ambiente organizado e saudável.</w:t>
         <w:br/>
         <w:br/>
         <w:t>Atenciosamente,</w:t>
@@ -359,6 +424,7 @@
     <w:p/>
     <w:p/>
     <w:p>
+      <w:proofErr w:type="spellStart"/>
       <w:r>
         <w:rPr>
           <w:rFonts w:ascii="Times New Roman" w:hAnsi="Times New Roman"/>
@@ -366,8 +432,27 @@
           <w:sz w:val="24"/>
         </w:rPr>
         <w:lastRenderedPageBreak/>
-        <w:t>Justificativa do responsável</w:t>
+        <w:t>Justificativa</w:t>
       </w:r>
+      <w:proofErr w:type="spellEnd"/>
+      <w:r>
+        <w:rPr>
+          <w:rFonts w:ascii="Times New Roman" w:hAnsi="Times New Roman"/>
+          <w:b/>
+          <w:sz w:val="24"/>
+        </w:rPr>
+        <w:t xml:space="preserve"> do </w:t>
+      </w:r>
+      <w:proofErr w:type="spellStart"/>
+      <w:r>
+        <w:rPr>
+          <w:rFonts w:ascii="Times New Roman" w:hAnsi="Times New Roman"/>
+          <w:b/>
+          <w:sz w:val="24"/>
+        </w:rPr>
+        <w:t>responsável</w:t>
+      </w:r>
+      <w:proofErr w:type="spellEnd"/>
     </w:p>
     <w:p>
       <w:r>
@@ -403,6 +488,7 @@
     <w:p>
       <w:pPr>
         <w:spacing w:after="0"/>
+        <w:jc w:val="center"/>
       </w:pPr>
       <w:r>
         <w:rPr>
@@ -415,53 +501,80 @@
     <w:p>
       <w:pPr>
         <w:spacing w:after="0"/>
+        <w:jc w:val="center"/>
       </w:pPr>
+      <w:proofErr w:type="spellStart"/>
       <w:r>
         <w:rPr>
           <w:rFonts w:ascii="Times New Roman" w:hAnsi="Times New Roman"/>
           <w:sz w:val="24"/>
         </w:rPr>
-        <w:t>Assinatura Responsável</w:t>
+        <w:t>Assinatura</w:t>
       </w:r>
+      <w:proofErr w:type="spellEnd"/>
+      <w:r>
+        <w:rPr>
+          <w:rFonts w:ascii="Times New Roman" w:hAnsi="Times New Roman"/>
+          <w:sz w:val="24"/>
+        </w:rPr>
+        <w:t xml:space="preserve"> </w:t>
+      </w:r>
+      <w:proofErr w:type="spellStart"/>
+      <w:r>
+        <w:rPr>
+          <w:rFonts w:ascii="Times New Roman" w:hAnsi="Times New Roman"/>
+          <w:sz w:val="24"/>
+        </w:rPr>
+        <w:t>Responsável</w:t>
+      </w:r>
+      <w:proofErr w:type="spellEnd"/>
     </w:p>
     <w:p>
       <w:pPr>
         <w:spacing w:after="0"/>
+        <w:jc w:val="center"/>
       </w:pPr>
     </w:p>
     <w:p>
       <w:pPr>
         <w:spacing w:after="0"/>
+        <w:jc w:val="center"/>
       </w:pPr>
     </w:p>
     <w:p>
       <w:pPr>
         <w:spacing w:after="0"/>
+        <w:jc w:val="center"/>
       </w:pPr>
     </w:p>
     <w:p>
       <w:pPr>
         <w:spacing w:after="0"/>
+        <w:jc w:val="center"/>
       </w:pPr>
     </w:p>
     <w:p>
       <w:pPr>
         <w:spacing w:after="0"/>
+        <w:jc w:val="center"/>
       </w:pPr>
     </w:p>
     <w:p>
       <w:pPr>
         <w:spacing w:after="0"/>
+        <w:jc w:val="center"/>
       </w:pPr>
     </w:p>
     <w:p>
       <w:pPr>
         <w:spacing w:after="0"/>
+        <w:jc w:val="center"/>
       </w:pPr>
     </w:p>
     <w:p>
       <w:pPr>
         <w:spacing w:after="0"/>
+        <w:jc w:val="center"/>
       </w:pPr>
       <w:r>
         <w:rPr>
@@ -474,14 +587,54 @@
     <w:p>
       <w:pPr>
         <w:spacing w:after="0"/>
+        <w:jc w:val="center"/>
       </w:pPr>
+      <w:proofErr w:type="spellStart"/>
       <w:r>
         <w:rPr>
           <w:rFonts w:ascii="Times New Roman" w:hAnsi="Times New Roman"/>
           <w:sz w:val="24"/>
         </w:rPr>
-        <w:t>Assinatura Coordenador de Turno</w:t>
+        <w:t>Assinatura</w:t>
       </w:r>
+      <w:proofErr w:type="spellEnd"/>
+      <w:r>
+        <w:rPr>
+          <w:rFonts w:ascii="Times New Roman" w:hAnsi="Times New Roman"/>
+          <w:sz w:val="24"/>
+        </w:rPr>
+        <w:t xml:space="preserve"> </w:t>
+      </w:r>
+      <w:proofErr w:type="spellStart"/>
+      <w:r>
+        <w:rPr>
+          <w:rFonts w:ascii="Times New Roman" w:hAnsi="Times New Roman"/>
+          <w:sz w:val="24"/>
+        </w:rPr>
+        <w:t>Coordenador</w:t>
+      </w:r>
+      <w:proofErr w:type="spellEnd"/>
+      <w:r>
+        <w:rPr>
+          <w:rFonts w:ascii="Times New Roman" w:hAnsi="Times New Roman"/>
+          <w:sz w:val="24"/>
+        </w:rPr>
+        <w:t xml:space="preserve"> de </w:t>
+      </w:r>
+      <w:proofErr w:type="spellStart"/>
+      <w:r>
+        <w:rPr>
+          <w:rFonts w:ascii="Times New Roman" w:hAnsi="Times New Roman"/>
+          <w:sz w:val="24"/>
+        </w:rPr>
+        <w:t>Turno</w:t>
+      </w:r>
+      <w:proofErr w:type="spellEnd"/>
+    </w:p>
+    <w:p>
+      <w:pPr>
+        <w:jc w:val="right"/>
+      </w:pPr>
     </w:p>
     <w:p>
       <w:pPr>
@@ -492,7 +645,7 @@
           <w:rFonts w:ascii="Times New Roman" w:hAnsi="Times New Roman"/>
           <w:sz w:val="24"/>
         </w:rPr>
-        <w:t>— – —, 09 de abril de 2026</w:t>
+        <w:t>Cruzeiro do Sul – Acre, 14 de abril de 2026</w:t>
       </w:r>
     </w:p>
     <w:sectPr>
@@ -528,7 +681,7 @@
 </file>
 
 <file path=word/numbering.xml><?xml version="1.0" encoding="utf-8"?>
-<w:numbering xmlns:wpc="http://schemas.microsoft.com/office/word/2010/wordprocessingCanvas" xmlns:cx="http://schemas.microsoft.com/office/drawing/2014/chartex" xmlns:cx1="http://schemas.microsoft.com/office/drawing/2015/9/8/chartex" xmlns:cx2="http://schemas.microsoft.com/office/drawing/2015/10/21/chartex" xmlns:cx3="http://schemas.microsoft.com/office/drawing/2016/5/9/chartex" xmlns:cx4="http://schemas.microsoft.com/office/drawing/2016/5/10/chartex" xmlns:cx5="http://schemas.microsoft.com/office/drawing/2016/5/11/chartex" xmlns:cx6="http://schemas.microsoft.com/office/drawing/2016/5/12/chartex" xmlns:cx7="http://schemas.microsoft.com/office/drawing/2016/5/13/chartex" xmlns:cx8="http://schemas.microsoft.com/office/drawing/2016/5/14/chartex" xmlns:mc="http://schemas.openxmlformats.org/markup-compatibility/2006" xmlns:aink="http://schemas.microsoft.com/office/drawing/2016/ink" xmlns:am3d="http://schemas.microsoft.com/office/drawing/2017/model3d" xmlns:o="urn:schemas-microsoft-com:office:office" xmlns:oel="http://schemas.microsoft.com/office/2019/extlst" xmlns:r="http://schemas.openxmlformats.org/officeDocument/2006/relationships" xmlns:m="http://schemas.openxmlformats.org/officeDocument/2006/math" xmlns:v="urn:schemas-microsoft-com:vml" xmlns:wp14="http://schemas.microsoft.com/office/word/2010/wordprocessingDrawing" xmlns:wp="http://schemas.openxmlformats.org/drawingml/2006/wordprocessingDrawing" xmlns:w10="urn:schemas-microsoft-com:office:word" xmlns:w="http://schemas.openxmlformats.org/wordprocessingml/2006/main" xmlns:w14="http://schemas.microsoft.com/office/word/2010/wordml" xmlns:w15="http://schemas.microsoft.com/office/word/2012/wordml" xmlns:w16cex="http://schemas.microsoft.com/office/word/2018/wordml/cex" xmlns:w16cid="http://schemas.microsoft.com/office/word/2016/wordml/cid" xmlns:w16="http://schemas.microsoft.com/office/word/2018/wordml" xmlns:w16du="http://schemas.microsoft.com/office/word/2023/wordml/word16du" xmlns:w16sdtdh="http://schemas.microsoft.com/office/word/2020/wordml/sdtdatahash" xmlns:w16sdtfl="http://schemas.microsoft.com/office/word/2024/wordml/sdtformatlock" xmlns:w16se="http://schemas.microsoft.com/office/word/2015/wordml/symex" xmlns:wpg="http://schemas.microsoft.com/office/word/2010/wordprocessingGroup" xmlns:wpi="http://schemas.microsoft.com/office/word/2010/wordprocessingInk" xmlns:wne="http://schemas.microsoft.com/office/word/2006/wordml" xmlns:wps="http://schemas.microsoft.com/office/word/2010/wordprocessingShape" mc:Ignorable="w14 w15 w16se w16cid w16 w16cex w16sdtdh w16sdtfl w16du wp14">
+<w:numbering xmlns:wpc="http://schemas.microsoft.com/office/word/2010/wordprocessingCanvas" xmlns:cx="http://schemas.microsoft.com/office/drawing/2014/chartex" xmlns:cx1="http://schemas.microsoft.com/office/drawing/2015/9/8/chartex" xmlns:mc="http://schemas.openxmlformats.org/markup-compatibility/2006" xmlns:o="urn:schemas-microsoft-com:office:office" xmlns:r="http://schemas.openxmlformats.org/officeDocument/2006/relationships" xmlns:m="http://schemas.openxmlformats.org/officeDocument/2006/math" xmlns:v="urn:schemas-microsoft-com:vml" xmlns:wp14="http://schemas.microsoft.com/office/word/2010/wordprocessingDrawing" xmlns:wp="http://schemas.openxmlformats.org/drawingml/2006/wordprocessingDrawing" xmlns:w10="urn:schemas-microsoft-com:office:word" xmlns:w="http://schemas.openxmlformats.org/wordprocessingml/2006/main" xmlns:w14="http://schemas.microsoft.com/office/word/2010/wordml" xmlns:w15="http://schemas.microsoft.com/office/word/2012/wordml" xmlns:w16se="http://schemas.microsoft.com/office/word/2015/wordml/symex" xmlns:wpg="http://schemas.microsoft.com/office/word/2010/wordprocessingGroup" xmlns:wpi="http://schemas.microsoft.com/office/word/2010/wordprocessingInk" xmlns:wne="http://schemas.microsoft.com/office/word/2006/wordml" xmlns:wps="http://schemas.microsoft.com/office/word/2010/wordprocessingShape" mc:Ignorable="w14 w15 w16se wp14">
   <w:abstractNum w:abstractNumId="0" w15:restartNumberingAfterBreak="0">
     <w:nsid w:val="FFFFFF7C"/>
     <w:multiLevelType w:val="singleLevel"/>
@@ -700,38 +853,38 @@
       </w:rPr>
     </w:lvl>
   </w:abstractNum>
-  <w:num w:numId="1" w16cid:durableId="1412197179">
+  <w:num w:numId="1">
     <w:abstractNumId w:val="8"/>
   </w:num>
-  <w:num w:numId="2" w16cid:durableId="1488863961">
+  <w:num w:numId="2">
     <w:abstractNumId w:val="6"/>
   </w:num>
-  <w:num w:numId="3" w16cid:durableId="1720977597">
+  <w:num w:numId="3">
     <w:abstractNumId w:val="5"/>
   </w:num>
-  <w:num w:numId="4" w16cid:durableId="1827041946">
+  <w:num w:numId="4">
     <w:abstractNumId w:val="4"/>
   </w:num>
-  <w:num w:numId="5" w16cid:durableId="676881120">
+  <w:num w:numId="5">
     <w:abstractNumId w:val="7"/>
   </w:num>
-  <w:num w:numId="6" w16cid:durableId="165678513">
+  <w:num w:numId="6">
     <w:abstractNumId w:val="3"/>
   </w:num>
-  <w:num w:numId="7" w16cid:durableId="869493903">
+  <w:num w:numId="7">
     <w:abstractNumId w:val="2"/>
   </w:num>
-  <w:num w:numId="8" w16cid:durableId="1141577301">
+  <w:num w:numId="8">
     <w:abstractNumId w:val="1"/>
   </w:num>
-  <w:num w:numId="9" w16cid:durableId="634483123">
+  <w:num w:numId="9">
     <w:abstractNumId w:val="0"/>
   </w:num>
 </w:numbering>
 </file>
 
 <file path=word/styles.xml><?xml version="1.0" encoding="utf-8"?>
-<w:styles xmlns:mc="http://schemas.openxmlformats.org/markup-compatibility/2006" xmlns:r="http://schemas.openxmlformats.org/officeDocument/2006/relationships" xmlns:w="http://schemas.openxmlformats.org/wordprocessingml/2006/main" xmlns:w14="http://schemas.microsoft.com/office/word/2010/wordml" xmlns:w15="http://schemas.microsoft.com/office/word/2012/wordml" xmlns:w16cex="http://schemas.microsoft.com/office/word/2018/wordml/cex" xmlns:w16cid="http://schemas.microsoft.com/office/word/2016/wordml/cid" xmlns:w16="http://schemas.microsoft.com/office/word/2018/wordml" xmlns:w16du="http://schemas.microsoft.com/office/word/2023/wordml/word16du" xmlns:w16sdtdh="http://schemas.microsoft.com/office/word/2020/wordml/sdtdatahash" xmlns:w16sdtfl="http://schemas.microsoft.com/office/word/2024/wordml/sdtformatlock" xmlns:w16se="http://schemas.microsoft.com/office/word/2015/wordml/symex" mc:Ignorable="w14 w15 w16se w16cid w16 w16cex w16sdtdh w16sdtfl w16du">
+<w:styles xmlns:mc="http://schemas.openxmlformats.org/markup-compatibility/2006" xmlns:r="http://schemas.openxmlformats.org/officeDocument/2006/relationships" xmlns:w="http://schemas.openxmlformats.org/wordprocessingml/2006/main" xmlns:w14="http://schemas.microsoft.com/office/word/2010/wordml" xmlns:w15="http://schemas.microsoft.com/office/word/2012/wordml" xmlns:w16se="http://schemas.microsoft.com/office/word/2015/wordml/symex" mc:Ignorable="w14 w15 w16se">
   <w:docDefaults>
     <w:rPrDefault>
       <w:rPr>
@@ -747,7 +900,7 @@
       </w:pPr>
     </w:pPrDefault>
   </w:docDefaults>
-  <w:latentStyles w:defLockedState="0" w:defUIPriority="99" w:defSemiHidden="0" w:defUnhideWhenUsed="0" w:defQFormat="0" w:count="376">
+  <w:latentStyles w:defLockedState="0" w:defUIPriority="99" w:defSemiHidden="0" w:defUnhideWhenUsed="0" w:defQFormat="0" w:count="371">
     <w:lsdException w:name="Normal" w:uiPriority="0" w:qFormat="1"/>
     <w:lsdException w:name="heading 1" w:uiPriority="9" w:qFormat="1"/>
     <w:lsdException w:name="heading 2" w:semiHidden="1" w:uiPriority="9" w:unhideWhenUsed="1" w:qFormat="1"/>
@@ -1110,11 +1263,6 @@
     <w:lsdException w:name="List Table 5 Dark Accent 6" w:uiPriority="50"/>
     <w:lsdException w:name="List Table 6 Colorful Accent 6" w:uiPriority="51"/>
     <w:lsdException w:name="List Table 7 Colorful Accent 6" w:uiPriority="52"/>
-    <w:lsdException w:name="Mention" w:semiHidden="1" w:unhideWhenUsed="1"/>
-    <w:lsdException w:name="Smart Hyperlink" w:semiHidden="1" w:unhideWhenUsed="1"/>
-    <w:lsdException w:name="Hashtag" w:semiHidden="1" w:unhideWhenUsed="1"/>
-    <w:lsdException w:name="Unresolved Mention" w:semiHidden="1" w:unhideWhenUsed="1"/>
-    <w:lsdException w:name="Smart Link" w:semiHidden="1" w:unhideWhenUsed="1"/>
   </w:latentStyles>
   <w:style w:type="paragraph" w:default="1" w:styleId="Normal">
     <w:name w:val="Normal"/>
@@ -12438,7 +12586,7 @@
 </file>
 
 <file path=customXml/itemProps1.xml><?xml version="1.0" encoding="utf-8"?>
-<ds:datastoreItem xmlns:ds="http://schemas.openxmlformats.org/officeDocument/2006/customXml" ds:itemID="{EF278816-EC6F-A645-907D-7F25AECB1D4A}">
+<ds:datastoreItem xmlns:ds="http://schemas.openxmlformats.org/officeDocument/2006/customXml" ds:itemID="{E4BB5FB6-B22F-476B-AE44-81D81BE4EE07}">
   <ds:schemaRefs>
     <ds:schemaRef ds:uri="http://schemas.openxmlformats.org/officeDocument/2006/bibliography"/>
   </ds:schemaRefs>

</xml_diff>